<commit_message>
Add institutional product wireframes
Co-authored-by: arena-agent <297053741+arena-agent@users.noreply.github.com>
</commit_message>
<xml_diff>
--- a/docs/LSC_Institutional_Overview.docx
+++ b/docs/LSC_Institutional_Overview.docx
@@ -3339,6 +3339,1528 @@
         <w:t xml:space="preserve"> ______________________________</w:t>
       </w:r>
     </w:p>
+    <w:p>
+      <w:r>
+        <w:br w:type="page"/>
+      </w:r>
+    </w:p>
+    <w:p>
+      <w:pPr>
+        <w:pStyle w:val="Heading1"/>
+        <w:spacing w:before="0"/>
+      </w:pPr>
+      <w:r>
+        <w:t>Appendix — Concept wireframes</w:t>
+      </w:r>
+    </w:p>
+    <w:p>
+      <w:pPr>
+        <w:spacing w:after="160"/>
+      </w:pPr>
+      <w:r>
+        <w:t>These low-fidelity screens are included for institutional discussion, requirements gathering and stakeholder feedback. They are not final UI acceptance specifications.</w:t>
+      </w:r>
+    </w:p>
+    <w:p>
+      <w:pPr>
+        <w:pStyle w:val="Heading2"/>
+        <w:keepNext/>
+      </w:pPr>
+      <w:r>
+        <w:t>Wireframe 1 — sign-in and approved identity providers</w:t>
+      </w:r>
+    </w:p>
+    <w:p>
+      <w:pPr>
+        <w:spacing w:after="140"/>
+      </w:pPr>
+      <w:r>
+        <w:t>A conceptual authentication screen. Local login remains available; Google and Microsoft buttons are enabled only after their integrations are implemented and approved.</w:t>
+      </w:r>
+    </w:p>
+    <w:tbl>
+      <w:tblPr>
+        <w:tblW w:type="auto" w:w="0"/>
+        <w:jc w:val="center"/>
+        <w:tblLayout w:type="autofit"/>
+        <w:tblLook w:firstColumn="1" w:firstRow="1" w:lastColumn="0" w:lastRow="0" w:noHBand="0" w:noVBand="1" w:val="04A0"/>
+      </w:tblPr>
+      <w:tblGrid>
+        <w:gridCol w:w="5040"/>
+        <w:gridCol w:w="5040"/>
+      </w:tblGrid>
+      <w:tr>
+        <w:tc>
+          <w:tcPr>
+            <w:tcW w:type="dxa" w:w="5040"/>
+            <w:tcMar>
+              <w:top w:w="180" w:type="dxa"/>
+              <w:start w:w="180" w:type="dxa"/>
+              <w:bottom w:w="180" w:type="dxa"/>
+              <w:end w:w="180" w:type="dxa"/>
+            </w:tcMar>
+            <w:tcBorders>
+              <w:top w:val="single" w:sz="6" w:space="0" w:color="D9E3E8"/>
+              <w:left w:val="single" w:sz="6" w:space="0" w:color="D9E3E8"/>
+              <w:bottom w:val="single" w:sz="6" w:space="0" w:color="D9E3E8"/>
+              <w:right w:val="single" w:sz="6" w:space="0" w:color="D9E3E8"/>
+              <w:insideH w:val="single" w:sz="6" w:space="0" w:color="D9E3E8"/>
+              <w:insideV w:val="single" w:sz="6" w:space="0" w:color="D9E3E8"/>
+            </w:tcBorders>
+            <w:shd w:fill="123B63"/>
+          </w:tcPr>
+          <w:p>
+            <w:pPr>
+              <w:spacing w:after="80"/>
+            </w:pPr>
+            <w:r>
+              <w:rPr>
+                <w:rFonts w:ascii="Aptos" w:hAnsi="Aptos"/>
+                <w:b/>
+                <w:color w:val="FFFFFF"/>
+                <w:sz w:val="56"/>
+              </w:rPr>
+              <w:t>LSC</w:t>
+            </w:r>
+          </w:p>
+          <w:p>
+            <w:pPr>
+              <w:spacing w:after="700"/>
+            </w:pPr>
+            <w:r>
+              <w:rPr>
+                <w:rFonts w:ascii="Aptos" w:hAnsi="Aptos"/>
+                <w:b/>
+                <w:color w:val="61D895"/>
+                <w:sz w:val="18"/>
+              </w:rPr>
+              <w:t>LEARN  ·  SHARE  ·  CONNECT</w:t>
+            </w:r>
+          </w:p>
+          <w:p>
+            <w:pPr>
+              <w:spacing w:after="40"/>
+            </w:pPr>
+            <w:r>
+              <w:rPr>
+                <w:rFonts w:ascii="Aptos" w:hAnsi="Aptos"/>
+                <w:b/>
+                <w:color w:val="FFFFFF"/>
+                <w:sz w:val="36"/>
+              </w:rPr>
+              <w:t>Your study group,</w:t>
+            </w:r>
+          </w:p>
+          <w:p>
+            <w:pPr>
+              <w:spacing w:after="360"/>
+            </w:pPr>
+            <w:r>
+              <w:rPr>
+                <w:rFonts w:ascii="Aptos" w:hAnsi="Aptos"/>
+                <w:b/>
+                <w:color w:val="FFFFFF"/>
+                <w:sz w:val="36"/>
+              </w:rPr>
+              <w:t>in one place.</w:t>
+            </w:r>
+          </w:p>
+          <w:p>
+            <w:pPr>
+              <w:spacing w:after="500"/>
+            </w:pPr>
+            <w:r>
+              <w:rPr>
+                <w:rFonts w:ascii="Aptos" w:hAnsi="Aptos"/>
+                <w:b w:val="0"/>
+                <w:color w:val="DCECF2"/>
+                <w:sz w:val="20"/>
+              </w:rPr>
+              <w:t>A secure workspace for groups, tasks, files and chat.</w:t>
+            </w:r>
+          </w:p>
+          <w:p>
+            <w:pPr>
+              <w:spacing w:after="160"/>
+            </w:pPr>
+            <w:r>
+              <w:rPr>
+                <w:rFonts w:ascii="Aptos" w:hAnsi="Aptos"/>
+                <w:b w:val="0"/>
+                <w:color w:val="DCECF2"/>
+                <w:sz w:val="20"/>
+              </w:rPr>
+              <w:t>• Institution-ready workspace</w:t>
+            </w:r>
+          </w:p>
+          <w:p>
+            <w:pPr>
+              <w:spacing w:after="160"/>
+            </w:pPr>
+            <w:r>
+              <w:rPr>
+                <w:rFonts w:ascii="Aptos" w:hAnsi="Aptos"/>
+                <w:b w:val="0"/>
+                <w:color w:val="DCECF2"/>
+                <w:sz w:val="20"/>
+              </w:rPr>
+              <w:t>• Desktop and mobile access</w:t>
+            </w:r>
+          </w:p>
+          <w:p>
+            <w:pPr>
+              <w:spacing w:after="0"/>
+            </w:pPr>
+            <w:r>
+              <w:rPr>
+                <w:rFonts w:ascii="Aptos" w:hAnsi="Aptos"/>
+                <w:b w:val="0"/>
+                <w:color w:val="DCECF2"/>
+                <w:sz w:val="20"/>
+              </w:rPr>
+              <w:t>• Structured academic collaboration</w:t>
+            </w:r>
+          </w:p>
+        </w:tc>
+        <w:tc>
+          <w:tcPr>
+            <w:tcW w:type="dxa" w:w="5040"/>
+            <w:tcMar>
+              <w:top w:w="180" w:type="dxa"/>
+              <w:start w:w="180" w:type="dxa"/>
+              <w:bottom w:w="180" w:type="dxa"/>
+              <w:end w:w="180" w:type="dxa"/>
+            </w:tcMar>
+            <w:tcBorders>
+              <w:top w:val="single" w:sz="6" w:space="0" w:color="D9E3E8"/>
+              <w:left w:val="single" w:sz="6" w:space="0" w:color="D9E3E8"/>
+              <w:bottom w:val="single" w:sz="6" w:space="0" w:color="D9E3E8"/>
+              <w:right w:val="single" w:sz="6" w:space="0" w:color="D9E3E8"/>
+              <w:insideH w:val="single" w:sz="6" w:space="0" w:color="D9E3E8"/>
+              <w:insideV w:val="single" w:sz="6" w:space="0" w:color="D9E3E8"/>
+            </w:tcBorders>
+            <w:shd w:fill="FFFFFF"/>
+          </w:tcPr>
+          <w:p>
+            <w:pPr>
+              <w:spacing w:after="80"/>
+            </w:pPr>
+            <w:r>
+              <w:rPr>
+                <w:rFonts w:ascii="Aptos" w:hAnsi="Aptos"/>
+                <w:b/>
+                <w:color w:val="172A3A"/>
+                <w:sz w:val="38"/>
+              </w:rPr>
+              <w:t>Sign in to LSC</w:t>
+            </w:r>
+          </w:p>
+          <w:p>
+            <w:pPr>
+              <w:spacing w:after="320"/>
+            </w:pPr>
+            <w:r>
+              <w:rPr>
+                <w:rFonts w:ascii="Aptos" w:hAnsi="Aptos"/>
+                <w:b w:val="0"/>
+                <w:color w:val="607181"/>
+                <w:sz w:val="18"/>
+              </w:rPr>
+              <w:t>Use your account or an approved institution identity.</w:t>
+            </w:r>
+          </w:p>
+          <w:tbl>
+            <w:tblPr>
+              <w:tblW w:type="auto" w:w="0"/>
+              <w:jc w:val="center"/>
+              <w:tblLook w:firstColumn="1" w:firstRow="1" w:lastColumn="0" w:lastRow="0" w:noHBand="0" w:noVBand="1" w:val="04A0"/>
+            </w:tblPr>
+            <w:tblGrid>
+              <w:gridCol w:w="5040"/>
+            </w:tblGrid>
+            <w:tr>
+              <w:tc>
+                <w:tcPr>
+                  <w:tcW w:type="dxa" w:w="5040"/>
+                  <w:shd w:fill="FFFFFF"/>
+                  <w:tcMar>
+                    <w:top w:w="75" w:type="dxa"/>
+                    <w:start w:w="100" w:type="dxa"/>
+                    <w:bottom w:w="75" w:type="dxa"/>
+                    <w:end w:w="100" w:type="dxa"/>
+                  </w:tcMar>
+                  <w:tcBorders>
+                    <w:top w:val="single" w:sz="6" w:space="0" w:color="D9E3E8"/>
+                    <w:left w:val="single" w:sz="6" w:space="0" w:color="D9E3E8"/>
+                    <w:bottom w:val="single" w:sz="6" w:space="0" w:color="D9E3E8"/>
+                    <w:right w:val="single" w:sz="6" w:space="0" w:color="D9E3E8"/>
+                    <w:insideH w:val="single" w:sz="6" w:space="0" w:color="D9E3E8"/>
+                    <w:insideV w:val="single" w:sz="6" w:space="0" w:color="D9E3E8"/>
+                  </w:tcBorders>
+                </w:tcPr>
+                <w:p>
+                  <w:pPr>
+                    <w:spacing w:after="40"/>
+                  </w:pPr>
+                  <w:r>
+                    <w:rPr>
+                      <w:rFonts w:ascii="Aptos" w:hAnsi="Aptos"/>
+                      <w:b/>
+                      <w:color w:val="243746"/>
+                      <w:sz w:val="18"/>
+                    </w:rPr>
+                    <w:t>EMAIL ADDRESS</w:t>
+                  </w:r>
+                </w:p>
+                <w:p>
+                  <w:pPr>
+                    <w:spacing w:after="0"/>
+                  </w:pPr>
+                  <w:r>
+                    <w:rPr>
+                      <w:rFonts w:ascii="Aptos" w:hAnsi="Aptos"/>
+                      <w:b w:val="0"/>
+                      <w:color w:val="607181"/>
+                      <w:sz w:val="17"/>
+                    </w:rPr>
+                    <w:t>student@institution.ac.za</w:t>
+                  </w:r>
+                </w:p>
+              </w:tc>
+            </w:tr>
+          </w:tbl>
+          <w:p/>
+          <w:tbl>
+            <w:tblPr>
+              <w:tblW w:type="auto" w:w="0"/>
+              <w:jc w:val="center"/>
+              <w:tblLook w:firstColumn="1" w:firstRow="1" w:lastColumn="0" w:lastRow="0" w:noHBand="0" w:noVBand="1" w:val="04A0"/>
+            </w:tblPr>
+            <w:tblGrid>
+              <w:gridCol w:w="5040"/>
+            </w:tblGrid>
+            <w:tr>
+              <w:tc>
+                <w:tcPr>
+                  <w:tcW w:type="dxa" w:w="5040"/>
+                  <w:shd w:fill="FFFFFF"/>
+                  <w:tcMar>
+                    <w:top w:w="75" w:type="dxa"/>
+                    <w:start w:w="100" w:type="dxa"/>
+                    <w:bottom w:w="75" w:type="dxa"/>
+                    <w:end w:w="100" w:type="dxa"/>
+                  </w:tcMar>
+                  <w:tcBorders>
+                    <w:top w:val="single" w:sz="6" w:space="0" w:color="D9E3E8"/>
+                    <w:left w:val="single" w:sz="6" w:space="0" w:color="D9E3E8"/>
+                    <w:bottom w:val="single" w:sz="6" w:space="0" w:color="D9E3E8"/>
+                    <w:right w:val="single" w:sz="6" w:space="0" w:color="D9E3E8"/>
+                    <w:insideH w:val="single" w:sz="6" w:space="0" w:color="D9E3E8"/>
+                    <w:insideV w:val="single" w:sz="6" w:space="0" w:color="D9E3E8"/>
+                  </w:tcBorders>
+                </w:tcPr>
+                <w:p>
+                  <w:pPr>
+                    <w:spacing w:after="40"/>
+                  </w:pPr>
+                  <w:r>
+                    <w:rPr>
+                      <w:rFonts w:ascii="Aptos" w:hAnsi="Aptos"/>
+                      <w:b/>
+                      <w:color w:val="243746"/>
+                      <w:sz w:val="18"/>
+                    </w:rPr>
+                    <w:t>PASSWORD</w:t>
+                  </w:r>
+                </w:p>
+                <w:p>
+                  <w:pPr>
+                    <w:spacing w:after="0"/>
+                  </w:pPr>
+                  <w:r>
+                    <w:rPr>
+                      <w:rFonts w:ascii="Aptos" w:hAnsi="Aptos"/>
+                      <w:b w:val="0"/>
+                      <w:color w:val="607181"/>
+                      <w:sz w:val="17"/>
+                    </w:rPr>
+                    <w:t>••••••••••</w:t>
+                  </w:r>
+                </w:p>
+              </w:tc>
+            </w:tr>
+          </w:tbl>
+          <w:p/>
+          <w:tbl>
+            <w:tblPr>
+              <w:tblW w:type="auto" w:w="0"/>
+              <w:tblLook w:firstColumn="1" w:firstRow="1" w:lastColumn="0" w:lastRow="0" w:noHBand="0" w:noVBand="1" w:val="04A0"/>
+            </w:tblPr>
+            <w:tblGrid>
+              <w:gridCol w:w="5040"/>
+            </w:tblGrid>
+            <w:tr>
+              <w:tc>
+                <w:tcPr>
+                  <w:tcW w:type="dxa" w:w="5040"/>
+                  <w:shd w:fill="123B63"/>
+                  <w:tcMar>
+                    <w:top w:w="105" w:type="dxa"/>
+                    <w:start w:w="100" w:type="dxa"/>
+                    <w:bottom w:w="105" w:type="dxa"/>
+                    <w:end w:w="100" w:type="dxa"/>
+                  </w:tcMar>
+                  <w:tcBorders>
+                    <w:top w:val="single" w:sz="6" w:space="0" w:color="123B63"/>
+                    <w:left w:val="single" w:sz="6" w:space="0" w:color="123B63"/>
+                    <w:bottom w:val="single" w:sz="6" w:space="0" w:color="123B63"/>
+                    <w:right w:val="single" w:sz="6" w:space="0" w:color="123B63"/>
+                    <w:insideH w:val="single" w:sz="6" w:space="0" w:color="123B63"/>
+                    <w:insideV w:val="single" w:sz="6" w:space="0" w:color="123B63"/>
+                  </w:tcBorders>
+                </w:tcPr>
+                <w:p>
+                  <w:pPr>
+                    <w:spacing w:after="0"/>
+                    <w:jc w:val="center"/>
+                  </w:pPr>
+                  <w:r>
+                    <w:rPr>
+                      <w:rFonts w:ascii="Aptos" w:hAnsi="Aptos"/>
+                      <w:b/>
+                      <w:color w:val="FFFFFF"/>
+                      <w:sz w:val="20"/>
+                    </w:rPr>
+                    <w:t>Sign in</w:t>
+                  </w:r>
+                </w:p>
+              </w:tc>
+            </w:tr>
+          </w:tbl>
+          <w:p/>
+          <w:p>
+            <w:pPr>
+              <w:spacing w:after="200"/>
+              <w:jc w:val="center"/>
+            </w:pPr>
+            <w:r>
+              <w:rPr>
+                <w:rFonts w:ascii="Aptos" w:hAnsi="Aptos"/>
+                <w:b w:val="0"/>
+                <w:color w:val="123B63"/>
+                <w:sz w:val="18"/>
+              </w:rPr>
+              <w:t>Forgot password?</w:t>
+            </w:r>
+          </w:p>
+          <w:p>
+            <w:pPr>
+              <w:spacing w:after="140"/>
+              <w:jc w:val="center"/>
+            </w:pPr>
+            <w:r>
+              <w:rPr>
+                <w:rFonts w:ascii="Aptos" w:hAnsi="Aptos"/>
+                <w:b w:val="0"/>
+                <w:color w:val="607181"/>
+                <w:sz w:val="17"/>
+              </w:rPr>
+              <w:t>or continue with</w:t>
+            </w:r>
+          </w:p>
+          <w:tbl>
+            <w:tblPr>
+              <w:tblW w:type="auto" w:w="0"/>
+              <w:tblLook w:firstColumn="1" w:firstRow="1" w:lastColumn="0" w:lastRow="0" w:noHBand="0" w:noVBand="1" w:val="04A0"/>
+            </w:tblPr>
+            <w:tblGrid>
+              <w:gridCol w:w="2520"/>
+              <w:gridCol w:w="2520"/>
+            </w:tblGrid>
+            <w:tr>
+              <w:tc>
+                <w:tcPr>
+                  <w:tcW w:type="dxa" w:w="2520"/>
+                  <w:tcMar>
+                    <w:top w:w="85" w:type="dxa"/>
+                    <w:start w:w="80" w:type="dxa"/>
+                    <w:bottom w:w="85" w:type="dxa"/>
+                    <w:end w:w="80" w:type="dxa"/>
+                  </w:tcMar>
+                  <w:tcBorders>
+                    <w:top w:val="single" w:sz="6" w:space="0" w:color="D9E3E8"/>
+                    <w:left w:val="single" w:sz="6" w:space="0" w:color="D9E3E8"/>
+                    <w:bottom w:val="single" w:sz="6" w:space="0" w:color="D9E3E8"/>
+                    <w:right w:val="single" w:sz="6" w:space="0" w:color="D9E3E8"/>
+                    <w:insideH w:val="single" w:sz="6" w:space="0" w:color="D9E3E8"/>
+                    <w:insideV w:val="single" w:sz="6" w:space="0" w:color="D9E3E8"/>
+                  </w:tcBorders>
+                </w:tcPr>
+                <w:p>
+                  <w:pPr>
+                    <w:spacing w:after="0"/>
+                    <w:jc w:val="center"/>
+                  </w:pPr>
+                  <w:r>
+                    <w:rPr>
+                      <w:rFonts w:ascii="Aptos" w:hAnsi="Aptos"/>
+                      <w:b/>
+                      <w:color w:val="243746"/>
+                      <w:sz w:val="18"/>
+                    </w:rPr>
+                    <w:t>Google</w:t>
+                  </w:r>
+                </w:p>
+              </w:tc>
+              <w:tc>
+                <w:tcPr>
+                  <w:tcW w:type="dxa" w:w="2520"/>
+                  <w:tcMar>
+                    <w:top w:w="85" w:type="dxa"/>
+                    <w:start w:w="80" w:type="dxa"/>
+                    <w:bottom w:w="85" w:type="dxa"/>
+                    <w:end w:w="80" w:type="dxa"/>
+                  </w:tcMar>
+                  <w:tcBorders>
+                    <w:top w:val="single" w:sz="6" w:space="0" w:color="D9E3E8"/>
+                    <w:left w:val="single" w:sz="6" w:space="0" w:color="D9E3E8"/>
+                    <w:bottom w:val="single" w:sz="6" w:space="0" w:color="D9E3E8"/>
+                    <w:right w:val="single" w:sz="6" w:space="0" w:color="D9E3E8"/>
+                    <w:insideH w:val="single" w:sz="6" w:space="0" w:color="D9E3E8"/>
+                    <w:insideV w:val="single" w:sz="6" w:space="0" w:color="D9E3E8"/>
+                  </w:tcBorders>
+                </w:tcPr>
+                <w:p>
+                  <w:pPr>
+                    <w:spacing w:after="0"/>
+                    <w:jc w:val="center"/>
+                  </w:pPr>
+                  <w:r>
+                    <w:rPr>
+                      <w:rFonts w:ascii="Aptos" w:hAnsi="Aptos"/>
+                      <w:b/>
+                      <w:color w:val="243746"/>
+                      <w:sz w:val="18"/>
+                    </w:rPr>
+                    <w:t>Microsoft</w:t>
+                  </w:r>
+                </w:p>
+              </w:tc>
+            </w:tr>
+          </w:tbl>
+          <w:p/>
+        </w:tc>
+      </w:tr>
+    </w:tbl>
+    <w:p>
+      <w:pPr>
+        <w:spacing w:after="20"/>
+      </w:pPr>
+    </w:p>
+    <w:p>
+      <w:pPr>
+        <w:spacing w:after="240"/>
+        <w:jc w:val="center"/>
+      </w:pPr>
+      <w:r>
+        <w:rPr>
+          <w:rFonts w:ascii="Aptos" w:hAnsi="Aptos"/>
+          <w:i/>
+          <w:color w:val="607181"/>
+          <w:sz w:val="17"/>
+        </w:rPr>
+        <w:t>Concept wireframe; provider buttons depend on completed Google OpenID Connect and Microsoft Entra integration.</w:t>
+      </w:r>
+    </w:p>
+    <w:p>
+      <w:pPr>
+        <w:pStyle w:val="Heading2"/>
+        <w:keepNext/>
+      </w:pPr>
+      <w:r>
+        <w:t>Wireframe 2 — student dashboard</w:t>
+      </w:r>
+    </w:p>
+    <w:p>
+      <w:pPr>
+        <w:spacing w:after="140"/>
+      </w:pPr>
+      <w:r>
+        <w:t>A conceptual landing screen that gives students an immediate view of groups, open tasks and recent activity.</w:t>
+      </w:r>
+    </w:p>
+    <w:tbl>
+      <w:tblPr>
+        <w:tblW w:type="auto" w:w="0"/>
+        <w:jc w:val="center"/>
+        <w:tblLayout w:type="autofit"/>
+        <w:tblLook w:firstColumn="1" w:firstRow="1" w:lastColumn="0" w:lastRow="0" w:noHBand="0" w:noVBand="1" w:val="04A0"/>
+      </w:tblPr>
+      <w:tblGrid>
+        <w:gridCol w:w="5040"/>
+        <w:gridCol w:w="5040"/>
+      </w:tblGrid>
+      <w:tr>
+        <w:tc>
+          <w:tcPr>
+            <w:tcW w:type="dxa" w:w="5040"/>
+            <w:tcMar>
+              <w:top w:w="120" w:type="dxa"/>
+              <w:start w:w="120" w:type="dxa"/>
+              <w:bottom w:w="120" w:type="dxa"/>
+              <w:end w:w="120" w:type="dxa"/>
+            </w:tcMar>
+            <w:tcBorders>
+              <w:top w:val="single" w:sz="6" w:space="0" w:color="123B63"/>
+              <w:left w:val="single" w:sz="6" w:space="0" w:color="123B63"/>
+              <w:bottom w:val="single" w:sz="6" w:space="0" w:color="123B63"/>
+              <w:right w:val="single" w:sz="6" w:space="0" w:color="123B63"/>
+              <w:insideH w:val="single" w:sz="6" w:space="0" w:color="123B63"/>
+              <w:insideV w:val="single" w:sz="6" w:space="0" w:color="123B63"/>
+            </w:tcBorders>
+            <w:shd w:fill="172A3A"/>
+          </w:tcPr>
+          <w:p>
+            <w:pPr>
+              <w:spacing w:after="60"/>
+            </w:pPr>
+            <w:r>
+              <w:rPr>
+                <w:rFonts w:ascii="Aptos" w:hAnsi="Aptos"/>
+                <w:b/>
+                <w:color w:val="FFFFFF"/>
+                <w:sz w:val="40"/>
+              </w:rPr>
+              <w:t>LSC</w:t>
+            </w:r>
+          </w:p>
+          <w:p>
+            <w:pPr>
+              <w:spacing w:after="400"/>
+            </w:pPr>
+            <w:r>
+              <w:rPr>
+                <w:rFonts w:ascii="Aptos" w:hAnsi="Aptos"/>
+                <w:b/>
+                <w:color w:val="61D895"/>
+                <w:sz w:val="16"/>
+              </w:rPr>
+              <w:t>STUDENT HUB</w:t>
+            </w:r>
+          </w:p>
+          <w:p>
+            <w:pPr>
+              <w:spacing w:after="200"/>
+            </w:pPr>
+            <w:r>
+              <w:rPr>
+                <w:rFonts w:ascii="Aptos" w:hAnsi="Aptos"/>
+                <w:b/>
+                <w:color w:val="DCECF2"/>
+                <w:sz w:val="16"/>
+              </w:rPr>
+              <w:t>OVERVIEW</w:t>
+            </w:r>
+          </w:p>
+          <w:p>
+            <w:pPr>
+              <w:spacing w:after="200"/>
+            </w:pPr>
+            <w:r>
+              <w:rPr>
+                <w:rFonts w:ascii="Aptos" w:hAnsi="Aptos"/>
+                <w:b/>
+                <w:color w:val="FFFFFF"/>
+                <w:sz w:val="18"/>
+              </w:rPr>
+              <w:t>Dashboard</w:t>
+            </w:r>
+          </w:p>
+          <w:p>
+            <w:pPr>
+              <w:spacing w:after="200"/>
+            </w:pPr>
+            <w:r>
+              <w:rPr>
+                <w:rFonts w:ascii="Aptos" w:hAnsi="Aptos"/>
+                <w:b w:val="0"/>
+                <w:color w:val="DCECF2"/>
+                <w:sz w:val="18"/>
+              </w:rPr>
+              <w:t>My groups</w:t>
+            </w:r>
+          </w:p>
+          <w:p>
+            <w:pPr>
+              <w:spacing w:after="200"/>
+            </w:pPr>
+            <w:r>
+              <w:rPr>
+                <w:rFonts w:ascii="Aptos" w:hAnsi="Aptos"/>
+                <w:b w:val="0"/>
+                <w:color w:val="DCECF2"/>
+                <w:sz w:val="18"/>
+              </w:rPr>
+              <w:t>Tasks</w:t>
+            </w:r>
+          </w:p>
+          <w:p>
+            <w:pPr>
+              <w:spacing w:after="200"/>
+            </w:pPr>
+            <w:r>
+              <w:rPr>
+                <w:rFonts w:ascii="Aptos" w:hAnsi="Aptos"/>
+                <w:b w:val="0"/>
+                <w:color w:val="DCECF2"/>
+                <w:sz w:val="18"/>
+              </w:rPr>
+              <w:t>Notifications</w:t>
+            </w:r>
+          </w:p>
+          <w:p>
+            <w:pPr>
+              <w:spacing w:after="200"/>
+            </w:pPr>
+            <w:r>
+              <w:rPr>
+                <w:rFonts w:ascii="Aptos" w:hAnsi="Aptos"/>
+                <w:b/>
+                <w:color w:val="DCECF2"/>
+                <w:sz w:val="16"/>
+              </w:rPr>
+              <w:t>ACCOUNT</w:t>
+            </w:r>
+          </w:p>
+          <w:p>
+            <w:pPr>
+              <w:spacing w:after="160"/>
+            </w:pPr>
+            <w:r>
+              <w:rPr>
+                <w:rFonts w:ascii="Aptos" w:hAnsi="Aptos"/>
+                <w:b w:val="0"/>
+                <w:color w:val="DCECF2"/>
+                <w:sz w:val="18"/>
+              </w:rPr>
+              <w:t>Profile</w:t>
+            </w:r>
+          </w:p>
+          <w:p>
+            <w:pPr>
+              <w:spacing w:after="0"/>
+            </w:pPr>
+            <w:r>
+              <w:rPr>
+                <w:rFonts w:ascii="Aptos" w:hAnsi="Aptos"/>
+                <w:b w:val="0"/>
+                <w:color w:val="DCECF2"/>
+                <w:sz w:val="18"/>
+              </w:rPr>
+              <w:t>Settings</w:t>
+            </w:r>
+          </w:p>
+        </w:tc>
+        <w:tc>
+          <w:tcPr>
+            <w:tcW w:type="dxa" w:w="5040"/>
+            <w:tcMar>
+              <w:top w:w="120" w:type="dxa"/>
+              <w:start w:w="150" w:type="dxa"/>
+              <w:bottom w:w="120" w:type="dxa"/>
+              <w:end w:w="150" w:type="dxa"/>
+            </w:tcMar>
+            <w:tcBorders>
+              <w:top w:val="single" w:sz="6" w:space="0" w:color="D9E3E8"/>
+              <w:left w:val="single" w:sz="6" w:space="0" w:color="D9E3E8"/>
+              <w:bottom w:val="single" w:sz="6" w:space="0" w:color="D9E3E8"/>
+              <w:right w:val="single" w:sz="6" w:space="0" w:color="D9E3E8"/>
+              <w:insideH w:val="single" w:sz="6" w:space="0" w:color="D9E3E8"/>
+              <w:insideV w:val="single" w:sz="6" w:space="0" w:color="D9E3E8"/>
+            </w:tcBorders>
+            <w:shd w:fill="FFFFFF"/>
+          </w:tcPr>
+          <w:p>
+            <w:pPr>
+              <w:spacing w:after="60"/>
+            </w:pPr>
+            <w:r>
+              <w:rPr>
+                <w:rFonts w:ascii="Aptos" w:hAnsi="Aptos"/>
+                <w:b/>
+                <w:color w:val="172A3A"/>
+                <w:sz w:val="36"/>
+              </w:rPr>
+              <w:t>Good morning, Naledi</w:t>
+            </w:r>
+          </w:p>
+          <w:p>
+            <w:pPr>
+              <w:spacing w:after="240"/>
+            </w:pPr>
+            <w:r>
+              <w:rPr>
+                <w:rFonts w:ascii="Aptos" w:hAnsi="Aptos"/>
+                <w:b w:val="0"/>
+                <w:color w:val="607181"/>
+                <w:sz w:val="18"/>
+              </w:rPr>
+              <w:t>Keep your academic work moving forward.</w:t>
+            </w:r>
+          </w:p>
+          <w:tbl>
+            <w:tblPr>
+              <w:tblW w:type="auto" w:w="0"/>
+              <w:tblLook w:firstColumn="1" w:firstRow="1" w:lastColumn="0" w:lastRow="0" w:noHBand="0" w:noVBand="1" w:val="04A0"/>
+            </w:tblPr>
+            <w:tblGrid>
+              <w:gridCol w:w="1680"/>
+              <w:gridCol w:w="1680"/>
+              <w:gridCol w:w="1680"/>
+            </w:tblGrid>
+            <w:tr>
+              <w:tc>
+                <w:tcPr>
+                  <w:tcW w:type="dxa" w:w="1680"/>
+                  <w:tcMar>
+                    <w:top w:w="80" w:type="dxa"/>
+                    <w:start w:w="80" w:type="dxa"/>
+                    <w:bottom w:w="80" w:type="dxa"/>
+                    <w:end w:w="80" w:type="dxa"/>
+                  </w:tcMar>
+                  <w:shd w:fill="EFF6F8"/>
+                  <w:tcBorders>
+                    <w:top w:val="single" w:sz="6" w:space="0" w:color="D9E3E8"/>
+                    <w:left w:val="single" w:sz="6" w:space="0" w:color="D9E3E8"/>
+                    <w:bottom w:val="single" w:sz="6" w:space="0" w:color="D9E3E8"/>
+                    <w:right w:val="single" w:sz="6" w:space="0" w:color="D9E3E8"/>
+                    <w:insideH w:val="single" w:sz="6" w:space="0" w:color="D9E3E8"/>
+                    <w:insideV w:val="single" w:sz="6" w:space="0" w:color="D9E3E8"/>
+                  </w:tcBorders>
+                </w:tcPr>
+                <w:p>
+                  <w:pPr>
+                    <w:spacing w:after="80"/>
+                  </w:pPr>
+                  <w:r>
+                    <w:rPr>
+                      <w:rFonts w:ascii="Aptos" w:hAnsi="Aptos"/>
+                      <w:b/>
+                      <w:color w:val="607181"/>
+                      <w:sz w:val="15"/>
+                    </w:rPr>
+                    <w:t>ACTIVE GROUPS</w:t>
+                  </w:r>
+                </w:p>
+                <w:p>
+                  <w:pPr>
+                    <w:spacing w:after="0"/>
+                  </w:pPr>
+                  <w:r>
+                    <w:rPr>
+                      <w:rFonts w:ascii="Aptos" w:hAnsi="Aptos"/>
+                      <w:b/>
+                      <w:color w:val="123B63"/>
+                      <w:sz w:val="44"/>
+                    </w:rPr>
+                    <w:t>4</w:t>
+                  </w:r>
+                </w:p>
+                <w:p>
+                  <w:pPr>
+                    <w:spacing w:after="0"/>
+                  </w:pPr>
+                  <w:r>
+                    <w:rPr>
+                      <w:rFonts w:ascii="Aptos" w:hAnsi="Aptos"/>
+                      <w:b w:val="0"/>
+                      <w:color w:val="607181"/>
+                      <w:sz w:val="15"/>
+                    </w:rPr>
+                    <w:t>groups</w:t>
+                  </w:r>
+                </w:p>
+              </w:tc>
+              <w:tc>
+                <w:tcPr>
+                  <w:tcW w:type="dxa" w:w="1680"/>
+                  <w:tcMar>
+                    <w:top w:w="80" w:type="dxa"/>
+                    <w:start w:w="80" w:type="dxa"/>
+                    <w:bottom w:w="80" w:type="dxa"/>
+                    <w:end w:w="80" w:type="dxa"/>
+                  </w:tcMar>
+                  <w:shd w:fill="EEF9F2"/>
+                  <w:tcBorders>
+                    <w:top w:val="single" w:sz="6" w:space="0" w:color="D9E3E8"/>
+                    <w:left w:val="single" w:sz="6" w:space="0" w:color="D9E3E8"/>
+                    <w:bottom w:val="single" w:sz="6" w:space="0" w:color="D9E3E8"/>
+                    <w:right w:val="single" w:sz="6" w:space="0" w:color="D9E3E8"/>
+                    <w:insideH w:val="single" w:sz="6" w:space="0" w:color="D9E3E8"/>
+                    <w:insideV w:val="single" w:sz="6" w:space="0" w:color="D9E3E8"/>
+                  </w:tcBorders>
+                </w:tcPr>
+                <w:p>
+                  <w:pPr>
+                    <w:spacing w:after="80"/>
+                  </w:pPr>
+                  <w:r>
+                    <w:rPr>
+                      <w:rFonts w:ascii="Aptos" w:hAnsi="Aptos"/>
+                      <w:b/>
+                      <w:color w:val="607181"/>
+                      <w:sz w:val="15"/>
+                    </w:rPr>
+                    <w:t>OPEN TASKS</w:t>
+                  </w:r>
+                </w:p>
+                <w:p>
+                  <w:pPr>
+                    <w:spacing w:after="0"/>
+                  </w:pPr>
+                  <w:r>
+                    <w:rPr>
+                      <w:rFonts w:ascii="Aptos" w:hAnsi="Aptos"/>
+                      <w:b/>
+                      <w:color w:val="123B63"/>
+                      <w:sz w:val="44"/>
+                    </w:rPr>
+                    <w:t>7</w:t>
+                  </w:r>
+                </w:p>
+                <w:p>
+                  <w:pPr>
+                    <w:spacing w:after="0"/>
+                  </w:pPr>
+                  <w:r>
+                    <w:rPr>
+                      <w:rFonts w:ascii="Aptos" w:hAnsi="Aptos"/>
+                      <w:b w:val="0"/>
+                      <w:color w:val="607181"/>
+                      <w:sz w:val="15"/>
+                    </w:rPr>
+                    <w:t>to complete</w:t>
+                  </w:r>
+                </w:p>
+              </w:tc>
+              <w:tc>
+                <w:tcPr>
+                  <w:tcW w:type="dxa" w:w="1680"/>
+                  <w:tcMar>
+                    <w:top w:w="80" w:type="dxa"/>
+                    <w:start w:w="80" w:type="dxa"/>
+                    <w:bottom w:w="80" w:type="dxa"/>
+                    <w:end w:w="80" w:type="dxa"/>
+                  </w:tcMar>
+                  <w:shd w:fill="FFF8EF"/>
+                  <w:tcBorders>
+                    <w:top w:val="single" w:sz="6" w:space="0" w:color="D9E3E8"/>
+                    <w:left w:val="single" w:sz="6" w:space="0" w:color="D9E3E8"/>
+                    <w:bottom w:val="single" w:sz="6" w:space="0" w:color="D9E3E8"/>
+                    <w:right w:val="single" w:sz="6" w:space="0" w:color="D9E3E8"/>
+                    <w:insideH w:val="single" w:sz="6" w:space="0" w:color="D9E3E8"/>
+                    <w:insideV w:val="single" w:sz="6" w:space="0" w:color="D9E3E8"/>
+                  </w:tcBorders>
+                </w:tcPr>
+                <w:p>
+                  <w:pPr>
+                    <w:spacing w:after="80"/>
+                  </w:pPr>
+                  <w:r>
+                    <w:rPr>
+                      <w:rFonts w:ascii="Aptos" w:hAnsi="Aptos"/>
+                      <w:b/>
+                      <w:color w:val="607181"/>
+                      <w:sz w:val="15"/>
+                    </w:rPr>
+                    <w:t>NEW ACTIVITY</w:t>
+                  </w:r>
+                </w:p>
+                <w:p>
+                  <w:pPr>
+                    <w:spacing w:after="0"/>
+                  </w:pPr>
+                  <w:r>
+                    <w:rPr>
+                      <w:rFonts w:ascii="Aptos" w:hAnsi="Aptos"/>
+                      <w:b/>
+                      <w:color w:val="123B63"/>
+                      <w:sz w:val="44"/>
+                    </w:rPr>
+                    <w:t>12</w:t>
+                  </w:r>
+                </w:p>
+                <w:p>
+                  <w:pPr>
+                    <w:spacing w:after="0"/>
+                  </w:pPr>
+                  <w:r>
+                    <w:rPr>
+                      <w:rFonts w:ascii="Aptos" w:hAnsi="Aptos"/>
+                      <w:b w:val="0"/>
+                      <w:color w:val="607181"/>
+                      <w:sz w:val="15"/>
+                    </w:rPr>
+                    <w:t>updates</w:t>
+                  </w:r>
+                </w:p>
+              </w:tc>
+            </w:tr>
+          </w:tbl>
+          <w:p/>
+          <w:p>
+            <w:pPr>
+              <w:spacing w:after="140"/>
+            </w:pPr>
+            <w:r>
+              <w:rPr>
+                <w:rFonts w:ascii="Aptos" w:hAnsi="Aptos"/>
+                <w:b/>
+                <w:color w:val="172A3A"/>
+                <w:sz w:val="26"/>
+              </w:rPr>
+              <w:t>Your study groups</w:t>
+            </w:r>
+          </w:p>
+          <w:tbl>
+            <w:tblPr>
+              <w:tblW w:type="auto" w:w="0"/>
+              <w:tblLook w:firstColumn="1" w:firstRow="1" w:lastColumn="0" w:lastRow="0" w:noHBand="0" w:noVBand="1" w:val="04A0"/>
+            </w:tblPr>
+            <w:tblGrid>
+              <w:gridCol w:w="2520"/>
+              <w:gridCol w:w="2520"/>
+            </w:tblGrid>
+            <w:tr>
+              <w:tc>
+                <w:tcPr>
+                  <w:tcW w:type="dxa" w:w="2520"/>
+                  <w:tcMar>
+                    <w:top w:w="75" w:type="dxa"/>
+                    <w:start w:w="85" w:type="dxa"/>
+                    <w:bottom w:w="75" w:type="dxa"/>
+                    <w:end w:w="85" w:type="dxa"/>
+                  </w:tcMar>
+                  <w:tcBorders>
+                    <w:top w:val="single" w:sz="6" w:space="0" w:color="D9E3E8"/>
+                    <w:left w:val="single" w:sz="6" w:space="0" w:color="D9E3E8"/>
+                    <w:bottom w:val="single" w:sz="6" w:space="0" w:color="D9E3E8"/>
+                    <w:right w:val="single" w:sz="6" w:space="0" w:color="D9E3E8"/>
+                    <w:insideH w:val="single" w:sz="6" w:space="0" w:color="D9E3E8"/>
+                    <w:insideV w:val="single" w:sz="6" w:space="0" w:color="D9E3E8"/>
+                  </w:tcBorders>
+                </w:tcPr>
+                <w:p>
+                  <w:pPr>
+                    <w:spacing w:after="60"/>
+                  </w:pPr>
+                  <w:r>
+                    <w:rPr>
+                      <w:rFonts w:ascii="Aptos" w:hAnsi="Aptos"/>
+                      <w:b/>
+                      <w:color w:val="123B63"/>
+                      <w:sz w:val="18"/>
+                    </w:rPr>
+                    <w:t>Advanced Calculus</w:t>
+                  </w:r>
+                </w:p>
+                <w:p>
+                  <w:pPr>
+                    <w:spacing w:after="0"/>
+                  </w:pPr>
+                  <w:r>
+                    <w:rPr>
+                      <w:rFonts w:ascii="Aptos" w:hAnsi="Aptos"/>
+                      <w:b w:val="0"/>
+                      <w:color w:val="607181"/>
+                      <w:sz w:val="15"/>
+                    </w:rPr>
+                    <w:t>8 members · 3 open tasks</w:t>
+                  </w:r>
+                </w:p>
+              </w:tc>
+              <w:tc>
+                <w:tcPr>
+                  <w:tcW w:type="dxa" w:w="2520"/>
+                  <w:tcMar>
+                    <w:top w:w="75" w:type="dxa"/>
+                    <w:start w:w="85" w:type="dxa"/>
+                    <w:bottom w:w="75" w:type="dxa"/>
+                    <w:end w:w="85" w:type="dxa"/>
+                  </w:tcMar>
+                  <w:tcBorders>
+                    <w:top w:val="single" w:sz="6" w:space="0" w:color="D9E3E8"/>
+                    <w:left w:val="single" w:sz="6" w:space="0" w:color="D9E3E8"/>
+                    <w:bottom w:val="single" w:sz="6" w:space="0" w:color="D9E3E8"/>
+                    <w:right w:val="single" w:sz="6" w:space="0" w:color="D9E3E8"/>
+                    <w:insideH w:val="single" w:sz="6" w:space="0" w:color="D9E3E8"/>
+                    <w:insideV w:val="single" w:sz="6" w:space="0" w:color="D9E3E8"/>
+                  </w:tcBorders>
+                </w:tcPr>
+                <w:p>
+                  <w:pPr>
+                    <w:spacing w:after="60"/>
+                  </w:pPr>
+                  <w:r>
+                    <w:rPr>
+                      <w:rFonts w:ascii="Aptos" w:hAnsi="Aptos"/>
+                      <w:b/>
+                      <w:color w:val="123B63"/>
+                      <w:sz w:val="18"/>
+                    </w:rPr>
+                    <w:t>Research Methods</w:t>
+                  </w:r>
+                </w:p>
+                <w:p>
+                  <w:pPr>
+                    <w:spacing w:after="0"/>
+                  </w:pPr>
+                  <w:r>
+                    <w:rPr>
+                      <w:rFonts w:ascii="Aptos" w:hAnsi="Aptos"/>
+                      <w:b w:val="0"/>
+                      <w:color w:val="607181"/>
+                      <w:sz w:val="15"/>
+                    </w:rPr>
+                    <w:t>5 members · 2 open tasks</w:t>
+                  </w:r>
+                </w:p>
+              </w:tc>
+            </w:tr>
+            <w:tr>
+              <w:tc>
+                <w:tcPr>
+                  <w:tcW w:type="dxa" w:w="2520"/>
+                  <w:tcMar>
+                    <w:top w:w="75" w:type="dxa"/>
+                    <w:start w:w="85" w:type="dxa"/>
+                    <w:bottom w:w="75" w:type="dxa"/>
+                    <w:end w:w="85" w:type="dxa"/>
+                  </w:tcMar>
+                  <w:tcBorders>
+                    <w:top w:val="single" w:sz="6" w:space="0" w:color="D9E3E8"/>
+                    <w:left w:val="single" w:sz="6" w:space="0" w:color="D9E3E8"/>
+                    <w:bottom w:val="single" w:sz="6" w:space="0" w:color="D9E3E8"/>
+                    <w:right w:val="single" w:sz="6" w:space="0" w:color="D9E3E8"/>
+                    <w:insideH w:val="single" w:sz="6" w:space="0" w:color="D9E3E8"/>
+                    <w:insideV w:val="single" w:sz="6" w:space="0" w:color="D9E3E8"/>
+                  </w:tcBorders>
+                </w:tcPr>
+                <w:p>
+                  <w:pPr>
+                    <w:spacing w:after="60"/>
+                  </w:pPr>
+                  <w:r>
+                    <w:rPr>
+                      <w:rFonts w:ascii="Aptos" w:hAnsi="Aptos"/>
+                      <w:b/>
+                      <w:color w:val="123B63"/>
+                      <w:sz w:val="18"/>
+                    </w:rPr>
+                    <w:t>Physics Revision</w:t>
+                  </w:r>
+                </w:p>
+                <w:p>
+                  <w:pPr>
+                    <w:spacing w:after="0"/>
+                  </w:pPr>
+                  <w:r>
+                    <w:rPr>
+                      <w:rFonts w:ascii="Aptos" w:hAnsi="Aptos"/>
+                      <w:b w:val="0"/>
+                      <w:color w:val="607181"/>
+                      <w:sz w:val="15"/>
+                    </w:rPr>
+                    <w:t>12 members · 5 open tasks</w:t>
+                  </w:r>
+                </w:p>
+              </w:tc>
+              <w:tc>
+                <w:tcPr>
+                  <w:tcW w:type="dxa" w:w="2520"/>
+                  <w:tcMar>
+                    <w:top w:w="75" w:type="dxa"/>
+                    <w:start w:w="85" w:type="dxa"/>
+                    <w:bottom w:w="75" w:type="dxa"/>
+                    <w:end w:w="85" w:type="dxa"/>
+                  </w:tcMar>
+                  <w:tcBorders>
+                    <w:top w:val="single" w:sz="6" w:space="0" w:color="D9E3E8"/>
+                    <w:left w:val="single" w:sz="6" w:space="0" w:color="D9E3E8"/>
+                    <w:bottom w:val="single" w:sz="6" w:space="0" w:color="D9E3E8"/>
+                    <w:right w:val="single" w:sz="6" w:space="0" w:color="D9E3E8"/>
+                    <w:insideH w:val="single" w:sz="6" w:space="0" w:color="D9E3E8"/>
+                    <w:insideV w:val="single" w:sz="6" w:space="0" w:color="D9E3E8"/>
+                  </w:tcBorders>
+                </w:tcPr>
+                <w:p>
+                  <w:pPr>
+                    <w:spacing w:after="60"/>
+                  </w:pPr>
+                  <w:r>
+                    <w:rPr>
+                      <w:rFonts w:ascii="Aptos" w:hAnsi="Aptos"/>
+                      <w:b/>
+                      <w:color w:val="123B63"/>
+                      <w:sz w:val="18"/>
+                    </w:rPr>
+                    <w:t>Academic Writing</w:t>
+                  </w:r>
+                </w:p>
+                <w:p>
+                  <w:pPr>
+                    <w:spacing w:after="0"/>
+                  </w:pPr>
+                  <w:r>
+                    <w:rPr>
+                      <w:rFonts w:ascii="Aptos" w:hAnsi="Aptos"/>
+                      <w:b w:val="0"/>
+                      <w:color w:val="607181"/>
+                      <w:sz w:val="15"/>
+                    </w:rPr>
+                    <w:t>6 members · 1 open task</w:t>
+                  </w:r>
+                </w:p>
+              </w:tc>
+            </w:tr>
+            <w:tr>
+              <w:tc>
+                <w:tcPr>
+                  <w:tcW w:type="dxa" w:w="2520"/>
+                  <w:tcMar>
+                    <w:top w:w="75" w:type="dxa"/>
+                    <w:start w:w="85" w:type="dxa"/>
+                    <w:bottom w:w="75" w:type="dxa"/>
+                    <w:end w:w="85" w:type="dxa"/>
+                  </w:tcMar>
+                  <w:tcBorders>
+                    <w:top w:val="single" w:sz="6" w:space="0" w:color="D9E3E8"/>
+                    <w:left w:val="single" w:sz="6" w:space="0" w:color="D9E3E8"/>
+                    <w:bottom w:val="single" w:sz="6" w:space="0" w:color="D9E3E8"/>
+                    <w:right w:val="single" w:sz="6" w:space="0" w:color="D9E3E8"/>
+                    <w:insideH w:val="single" w:sz="6" w:space="0" w:color="D9E3E8"/>
+                    <w:insideV w:val="single" w:sz="6" w:space="0" w:color="D9E3E8"/>
+                  </w:tcBorders>
+                </w:tcPr>
+                <w:p>
+                  <w:pPr>
+                    <w:spacing w:after="60"/>
+                  </w:pPr>
+                  <w:r>
+                    <w:rPr>
+                      <w:rFonts w:ascii="Aptos" w:hAnsi="Aptos"/>
+                      <w:b/>
+                      <w:color w:val="123B63"/>
+                      <w:sz w:val="18"/>
+                    </w:rPr>
+                    <w:t>Data Science Lab</w:t>
+                  </w:r>
+                </w:p>
+                <w:p>
+                  <w:pPr>
+                    <w:spacing w:after="0"/>
+                  </w:pPr>
+                  <w:r>
+                    <w:rPr>
+                      <w:rFonts w:ascii="Aptos" w:hAnsi="Aptos"/>
+                      <w:b w:val="0"/>
+                      <w:color w:val="607181"/>
+                      <w:sz w:val="15"/>
+                    </w:rPr>
+                    <w:t>9 members · 4 open tasks</w:t>
+                  </w:r>
+                </w:p>
+              </w:tc>
+              <w:tc>
+                <w:tcPr>
+                  <w:tcW w:type="dxa" w:w="2520"/>
+                  <w:tcMar>
+                    <w:top w:w="75" w:type="dxa"/>
+                    <w:start w:w="85" w:type="dxa"/>
+                    <w:bottom w:w="75" w:type="dxa"/>
+                    <w:end w:w="85" w:type="dxa"/>
+                  </w:tcMar>
+                  <w:tcBorders>
+                    <w:top w:val="single" w:sz="6" w:space="0" w:color="D9E3E8"/>
+                    <w:left w:val="single" w:sz="6" w:space="0" w:color="D9E3E8"/>
+                    <w:bottom w:val="single" w:sz="6" w:space="0" w:color="D9E3E8"/>
+                    <w:right w:val="single" w:sz="6" w:space="0" w:color="D9E3E8"/>
+                    <w:insideH w:val="single" w:sz="6" w:space="0" w:color="D9E3E8"/>
+                    <w:insideV w:val="single" w:sz="6" w:space="0" w:color="D9E3E8"/>
+                  </w:tcBorders>
+                </w:tcPr>
+                <w:p>
+                  <w:pPr>
+                    <w:spacing w:after="60"/>
+                  </w:pPr>
+                  <w:r>
+                    <w:rPr>
+                      <w:rFonts w:ascii="Aptos" w:hAnsi="Aptos"/>
+                      <w:b/>
+                      <w:color w:val="123B63"/>
+                      <w:sz w:val="18"/>
+                    </w:rPr>
+                    <w:t>Study Skills</w:t>
+                  </w:r>
+                </w:p>
+                <w:p>
+                  <w:pPr>
+                    <w:spacing w:after="0"/>
+                  </w:pPr>
+                  <w:r>
+                    <w:rPr>
+                      <w:rFonts w:ascii="Aptos" w:hAnsi="Aptos"/>
+                      <w:b w:val="0"/>
+                      <w:color w:val="607181"/>
+                      <w:sz w:val="15"/>
+                    </w:rPr>
+                    <w:t>4 members · 2 open tasks</w:t>
+                  </w:r>
+                </w:p>
+              </w:tc>
+            </w:tr>
+          </w:tbl>
+          <w:p/>
+          <w:p>
+            <w:pPr>
+              <w:spacing w:after="140"/>
+            </w:pPr>
+            <w:r>
+              <w:rPr>
+                <w:rFonts w:ascii="Aptos" w:hAnsi="Aptos"/>
+                <w:b/>
+                <w:color w:val="172A3A"/>
+                <w:sz w:val="26"/>
+              </w:rPr>
+              <w:t>Upcoming tasks</w:t>
+            </w:r>
+          </w:p>
+          <w:tbl>
+            <w:tblPr>
+              <w:tblW w:type="auto" w:w="0"/>
+              <w:jc w:val="center"/>
+              <w:tblLook w:firstColumn="1" w:firstRow="1" w:lastColumn="0" w:lastRow="0" w:noHBand="0" w:noVBand="1" w:val="04A0"/>
+            </w:tblPr>
+            <w:tblGrid>
+              <w:gridCol w:w="5040"/>
+            </w:tblGrid>
+            <w:tr>
+              <w:tc>
+                <w:tcPr>
+                  <w:tcW w:type="dxa" w:w="5040"/>
+                  <w:shd w:fill="EFF6F8"/>
+                  <w:tcMar>
+                    <w:top w:w="75" w:type="dxa"/>
+                    <w:start w:w="100" w:type="dxa"/>
+                    <w:bottom w:w="75" w:type="dxa"/>
+                    <w:end w:w="100" w:type="dxa"/>
+                  </w:tcMar>
+                  <w:tcBorders>
+                    <w:top w:val="single" w:sz="6" w:space="0" w:color="D9E3E8"/>
+                    <w:left w:val="single" w:sz="6" w:space="0" w:color="D9E3E8"/>
+                    <w:bottom w:val="single" w:sz="6" w:space="0" w:color="D9E3E8"/>
+                    <w:right w:val="single" w:sz="6" w:space="0" w:color="D9E3E8"/>
+                    <w:insideH w:val="single" w:sz="6" w:space="0" w:color="D9E3E8"/>
+                    <w:insideV w:val="single" w:sz="6" w:space="0" w:color="D9E3E8"/>
+                  </w:tcBorders>
+                </w:tcPr>
+                <w:p>
+                  <w:pPr>
+                    <w:spacing w:after="40"/>
+                  </w:pPr>
+                  <w:r>
+                    <w:rPr>
+                      <w:rFonts w:ascii="Aptos" w:hAnsi="Aptos"/>
+                      <w:b/>
+                      <w:color w:val="243746"/>
+                      <w:sz w:val="18"/>
+                    </w:rPr>
+                    <w:t>PREPARE LITERATURE REVIEW OUTLINE</w:t>
+                  </w:r>
+                </w:p>
+                <w:p>
+                  <w:pPr>
+                    <w:spacing w:after="0"/>
+                  </w:pPr>
+                  <w:r>
+                    <w:rPr>
+                      <w:rFonts w:ascii="Aptos" w:hAnsi="Aptos"/>
+                      <w:b w:val="0"/>
+                      <w:color w:val="607181"/>
+                      <w:sz w:val="17"/>
+                    </w:rPr>
+                    <w:t>Research Methods · Due Friday · Assigned to you</w:t>
+                  </w:r>
+                </w:p>
+              </w:tc>
+            </w:tr>
+          </w:tbl>
+          <w:p/>
+        </w:tc>
+      </w:tr>
+    </w:tbl>
+    <w:p>
+      <w:pPr>
+        <w:spacing w:after="20"/>
+      </w:pPr>
+    </w:p>
+    <w:p>
+      <w:pPr>
+        <w:spacing w:after="240"/>
+        <w:jc w:val="center"/>
+      </w:pPr>
+      <w:r>
+        <w:rPr>
+          <w:rFonts w:ascii="Aptos" w:hAnsi="Aptos"/>
+          <w:i/>
+          <w:color w:val="607181"/>
+          <w:sz w:val="17"/>
+        </w:rPr>
+        <w:t>Concept wireframe; institutions may adapt labels, roles and navigation to their academic model.</w:t>
+      </w:r>
+    </w:p>
+    <w:p>
+      <w:pPr>
+        <w:pStyle w:val="Heading2"/>
+        <w:keepNext/>
+      </w:pPr>
+      <w:r>
+        <w:t>Wireframe 3 — group workspace with chat and files</w:t>
+      </w:r>
+    </w:p>
+    <w:p>
+      <w:pPr>
+        <w:spacing w:after="120"/>
+      </w:pPr>
+      <w:r>
+        <w:t>This screen shows the collaboration area where members can discuss work and find recent shared resources.</w:t>
+      </w:r>
+    </w:p>
+    <w:p>
+      <w:pPr>
+        <w:jc w:val="center"/>
+      </w:pPr>
+      <w:r>
+        <w:drawing>
+          <wp:inline xmlns:a="http://schemas.openxmlformats.org/drawingml/2006/main" xmlns:pic="http://schemas.openxmlformats.org/drawingml/2006/picture">
+            <wp:extent cx="5989320" cy="3443859"/>
+            <wp:docPr id="2" name="Picture 2"/>
+            <wp:cNvGraphicFramePr>
+              <a:graphicFrameLocks noChangeAspect="1"/>
+            </wp:cNvGraphicFramePr>
+            <a:graphic>
+              <a:graphicData uri="http://schemas.openxmlformats.org/drawingml/2006/picture">
+                <pic:pic>
+                  <pic:nvPicPr>
+                    <pic:cNvPr id="0" name="chat_attachments_illustration.png"/>
+                    <pic:cNvPicPr/>
+                  </pic:nvPicPr>
+                  <pic:blipFill>
+                    <a:blip r:embed="rId12"/>
+                    <a:stretch>
+                      <a:fillRect/>
+                    </a:stretch>
+                  </pic:blipFill>
+                  <pic:spPr>
+                    <a:xfrm>
+                      <a:off x="0" y="0"/>
+                      <a:ext cx="5989320" cy="3443859"/>
+                    </a:xfrm>
+                    <a:prstGeom prst="rect"/>
+                  </pic:spPr>
+                </pic:pic>
+              </a:graphicData>
+            </a:graphic>
+          </wp:inline>
+        </w:drawing>
+      </w:r>
+    </w:p>
+    <w:p>
+      <w:pPr>
+        <w:spacing w:after="240"/>
+        <w:jc w:val="center"/>
+      </w:pPr>
+      <w:r>
+        <w:rPr>
+          <w:rFonts w:ascii="Aptos" w:hAnsi="Aptos"/>
+          <w:i/>
+          <w:color w:val="607181"/>
+          <w:sz w:val="17"/>
+        </w:rPr>
+        <w:t>Concept wireframe: group chat with a recent-files panel.</w:t>
+      </w:r>
+    </w:p>
+    <w:p>
+      <w:pPr>
+        <w:pStyle w:val="Heading2"/>
+        <w:keepNext/>
+      </w:pPr>
+      <w:r>
+        <w:t>Wireframe 4 — invitation and onboarding flow</w:t>
+      </w:r>
+    </w:p>
+    <w:p>
+      <w:pPr>
+        <w:spacing w:after="120"/>
+      </w:pPr>
+      <w:r>
+        <w:t>This workflow makes membership explicit from invitation through acceptance and collaboration.</w:t>
+      </w:r>
+    </w:p>
+    <w:p>
+      <w:pPr>
+        <w:jc w:val="center"/>
+      </w:pPr>
+      <w:r>
+        <w:drawing>
+          <wp:inline xmlns:a="http://schemas.openxmlformats.org/drawingml/2006/main" xmlns:pic="http://schemas.openxmlformats.org/drawingml/2006/picture">
+            <wp:extent cx="5989320" cy="2358295"/>
+            <wp:docPr id="3" name="Picture 3"/>
+            <wp:cNvGraphicFramePr>
+              <a:graphicFrameLocks noChangeAspect="1"/>
+            </wp:cNvGraphicFramePr>
+            <a:graphic>
+              <a:graphicData uri="http://schemas.openxmlformats.org/drawingml/2006/picture">
+                <pic:pic>
+                  <pic:nvPicPr>
+                    <pic:cNvPr id="0" name="invitation_workflow.png"/>
+                    <pic:cNvPicPr/>
+                  </pic:nvPicPr>
+                  <pic:blipFill>
+                    <a:blip r:embed="rId13"/>
+                    <a:stretch>
+                      <a:fillRect/>
+                    </a:stretch>
+                  </pic:blipFill>
+                  <pic:spPr>
+                    <a:xfrm>
+                      <a:off x="0" y="0"/>
+                      <a:ext cx="5989320" cy="2358295"/>
+                    </a:xfrm>
+                    <a:prstGeom prst="rect"/>
+                  </pic:spPr>
+                </pic:pic>
+              </a:graphicData>
+            </a:graphic>
+          </wp:inline>
+        </w:drawing>
+      </w:r>
+    </w:p>
+    <w:p>
+      <w:pPr>
+        <w:spacing w:after="240"/>
+        <w:jc w:val="center"/>
+      </w:pPr>
+      <w:r>
+        <w:rPr>
+          <w:rFonts w:ascii="Aptos" w:hAnsi="Aptos"/>
+          <w:i/>
+          <w:color w:val="607181"/>
+          <w:sz w:val="17"/>
+        </w:rPr>
+        <w:t>Concept workflow: create invite, share securely, accept before expiry, then collaborate.</w:t>
+      </w:r>
+    </w:p>
     <w:sectPr>
       <w:headerReference w:type="default" r:id="rId9"/>
       <w:footerReference w:type="default" r:id="rId10"/>

</xml_diff>